<commit_message>
correcting labels impacto renda gastos
</commit_message>
<xml_diff>
--- a/output/tabela_impacto_bandeira_completa.docx
+++ b/output/tabela_impacto_bandeira_completa.docx
@@ -18,12 +18,12 @@
       </w:tblPr>
       <w:tblGrid>
         <w:gridCol w:w="3345"/>
-        <w:gridCol w:w="839"/>
-        <w:gridCol w:w="839"/>
-        <w:gridCol w:w="839"/>
-        <w:gridCol w:w="839"/>
-        <w:gridCol w:w="839"/>
-        <w:gridCol w:w="839"/>
+        <w:gridCol w:w="2477"/>
+        <w:gridCol w:w="2416"/>
+        <w:gridCol w:w="2172"/>
+        <w:gridCol w:w="2477"/>
+        <w:gridCol w:w="2416"/>
+        <w:gridCol w:w="2172"/>
       </w:tblGrid>
       <w:tr>
         <w:trPr>
@@ -85,7 +85,6 @@
         </w:tc>
         <w:tc>
           <w:tcPr>
-            <w:gridSpan w:val="2"/>
             <w:tcBorders>
               <w:bottom w:val="none" w:sz="0" w:space="0" w:color="666666"/>
               <w:top w:val="single" w:sz="12" w:space="0" w:color="666666"/>
@@ -132,13 +131,12 @@
                 <w:szCs w:val="22"/>
                 <w:color w:val="000000"/>
               </w:rPr>
-              <w:t xml:space="preserve">Bandeira Amarela</w:t>
-            </w:r>
-          </w:p>
-        </w:tc>
-        <w:tc>
-          <w:tcPr>
-            <w:gridSpan w:val="2"/>
+              <w:t xml:space="preserve">Bandeira Vermelha II</w:t>
+            </w:r>
+          </w:p>
+        </w:tc>
+        <w:tc>
+          <w:tcPr>
             <w:tcBorders>
               <w:bottom w:val="none" w:sz="0" w:space="0" w:color="666666"/>
               <w:top w:val="single" w:sz="12" w:space="0" w:color="666666"/>
@@ -191,7 +189,6 @@
         </w:tc>
         <w:tc>
           <w:tcPr>
-            <w:gridSpan w:val="2"/>
             <w:tcBorders>
               <w:bottom w:val="none" w:sz="0" w:space="0" w:color="666666"/>
               <w:top w:val="single" w:sz="12" w:space="0" w:color="666666"/>
@@ -238,7 +235,163 @@
                 <w:szCs w:val="22"/>
                 <w:color w:val="000000"/>
               </w:rPr>
+              <w:t xml:space="preserve">Bandeira Amarela</w:t>
+            </w:r>
+          </w:p>
+        </w:tc>
+        <w:tc>
+          <w:tcPr>
+            <w:tcBorders>
+              <w:bottom w:val="none" w:sz="0" w:space="0" w:color="666666"/>
+              <w:top w:val="single" w:sz="12" w:space="0" w:color="666666"/>
+              <w:left w:val="none" w:sz="0" w:space="0" w:color="000000"/>
+              <w:right w:val="none" w:sz="0" w:space="0" w:color="000000"/>
+            </w:tcBorders>
+            <w:shd w:val="clear" w:color="auto" w:fill="FFFFFF"/>
+            <w:tcMar>
+              <w:top w:w="0" w:type="dxa"/>
+              <w:bottom w:w="0" w:type="dxa"/>
+              <w:left w:w="0" w:type="dxa"/>
+              <w:right w:w="0" w:type="dxa"/>
+            </w:tcMar>
+            <w:vAlign w:val="center"/>
+          </w:tcPr>
+          <w:p>
+            <w:pPr>
+              <w:jc w:val="center"/>
+              <w:pBdr>
+                <w:bottom w:val="none" w:sz="0" w:space="0" w:color="000000"/>
+                <w:top w:val="none" w:sz="0" w:space="0" w:color="000000"/>
+                <w:left w:val="none" w:sz="0" w:space="0" w:color="000000"/>
+                <w:right w:val="none" w:sz="0" w:space="0" w:color="000000"/>
+              </w:pBdr>
+              <w:spacing w:after="0" w:before="0" w:line="240"/>
+              <w:ind w:left="0" w:right="0" w:firstLine="0" w:firstLineChars="0"/>
+              <w:rPr>
+                <w:rFonts w:ascii="Times New Roman" w:hAnsi="Times New Roman" w:eastAsia="Times New Roman" w:cs="Times New Roman"/>
+                <w:i w:val="false"/>
+                <w:b w:val="false"/>
+                <w:u w:val="none"/>
+                <w:sz w:val="22"/>
+                <w:szCs w:val="22"/>
+                <w:color w:val="000000"/>
+              </w:rPr>
+            </w:pPr>
+            <w:r>
+              <w:rPr>
+                <w:rFonts w:ascii="Times New Roman" w:hAnsi="Times New Roman" w:eastAsia="Times New Roman" w:cs="Times New Roman"/>
+                <w:i w:val="false"/>
+                <w:b w:val="false"/>
+                <w:u w:val="none"/>
+                <w:sz w:val="22"/>
+                <w:szCs w:val="22"/>
+                <w:color w:val="000000"/>
+              </w:rPr>
               <w:t xml:space="preserve">Bandeira Vermelha II</w:t>
+            </w:r>
+          </w:p>
+        </w:tc>
+        <w:tc>
+          <w:tcPr>
+            <w:tcBorders>
+              <w:bottom w:val="none" w:sz="0" w:space="0" w:color="666666"/>
+              <w:top w:val="single" w:sz="12" w:space="0" w:color="666666"/>
+              <w:left w:val="none" w:sz="0" w:space="0" w:color="000000"/>
+              <w:right w:val="none" w:sz="0" w:space="0" w:color="000000"/>
+            </w:tcBorders>
+            <w:shd w:val="clear" w:color="auto" w:fill="FFFFFF"/>
+            <w:tcMar>
+              <w:top w:w="0" w:type="dxa"/>
+              <w:bottom w:w="0" w:type="dxa"/>
+              <w:left w:w="0" w:type="dxa"/>
+              <w:right w:w="0" w:type="dxa"/>
+            </w:tcMar>
+            <w:vAlign w:val="center"/>
+          </w:tcPr>
+          <w:p>
+            <w:pPr>
+              <w:jc w:val="center"/>
+              <w:pBdr>
+                <w:bottom w:val="none" w:sz="0" w:space="0" w:color="000000"/>
+                <w:top w:val="none" w:sz="0" w:space="0" w:color="000000"/>
+                <w:left w:val="none" w:sz="0" w:space="0" w:color="000000"/>
+                <w:right w:val="none" w:sz="0" w:space="0" w:color="000000"/>
+              </w:pBdr>
+              <w:spacing w:after="0" w:before="0" w:line="240"/>
+              <w:ind w:left="0" w:right="0" w:firstLine="0" w:firstLineChars="0"/>
+              <w:rPr>
+                <w:rFonts w:ascii="Times New Roman" w:hAnsi="Times New Roman" w:eastAsia="Times New Roman" w:cs="Times New Roman"/>
+                <w:i w:val="false"/>
+                <w:b w:val="false"/>
+                <w:u w:val="none"/>
+                <w:sz w:val="22"/>
+                <w:szCs w:val="22"/>
+                <w:color w:val="000000"/>
+              </w:rPr>
+            </w:pPr>
+            <w:r>
+              <w:rPr>
+                <w:rFonts w:ascii="Times New Roman" w:hAnsi="Times New Roman" w:eastAsia="Times New Roman" w:cs="Times New Roman"/>
+                <w:i w:val="false"/>
+                <w:b w:val="false"/>
+                <w:u w:val="none"/>
+                <w:sz w:val="22"/>
+                <w:szCs w:val="22"/>
+                <w:color w:val="000000"/>
+              </w:rPr>
+              <w:t xml:space="preserve">Bandeira Vermelha I</w:t>
+            </w:r>
+          </w:p>
+        </w:tc>
+        <w:tc>
+          <w:tcPr>
+            <w:tcBorders>
+              <w:bottom w:val="none" w:sz="0" w:space="0" w:color="666666"/>
+              <w:top w:val="single" w:sz="12" w:space="0" w:color="666666"/>
+              <w:left w:val="none" w:sz="0" w:space="0" w:color="000000"/>
+              <w:right w:val="none" w:sz="0" w:space="0" w:color="000000"/>
+            </w:tcBorders>
+            <w:shd w:val="clear" w:color="auto" w:fill="FFFFFF"/>
+            <w:tcMar>
+              <w:top w:w="0" w:type="dxa"/>
+              <w:bottom w:w="0" w:type="dxa"/>
+              <w:left w:w="0" w:type="dxa"/>
+              <w:right w:w="0" w:type="dxa"/>
+            </w:tcMar>
+            <w:vAlign w:val="center"/>
+          </w:tcPr>
+          <w:p>
+            <w:pPr>
+              <w:jc w:val="center"/>
+              <w:pBdr>
+                <w:bottom w:val="none" w:sz="0" w:space="0" w:color="000000"/>
+                <w:top w:val="none" w:sz="0" w:space="0" w:color="000000"/>
+                <w:left w:val="none" w:sz="0" w:space="0" w:color="000000"/>
+                <w:right w:val="none" w:sz="0" w:space="0" w:color="000000"/>
+              </w:pBdr>
+              <w:spacing w:after="0" w:before="0" w:line="240"/>
+              <w:ind w:left="0" w:right="0" w:firstLine="0" w:firstLineChars="0"/>
+              <w:rPr>
+                <w:rFonts w:ascii="Times New Roman" w:hAnsi="Times New Roman" w:eastAsia="Times New Roman" w:cs="Times New Roman"/>
+                <w:i w:val="false"/>
+                <w:b w:val="false"/>
+                <w:u w:val="none"/>
+                <w:sz w:val="22"/>
+                <w:szCs w:val="22"/>
+                <w:color w:val="000000"/>
+              </w:rPr>
+            </w:pPr>
+            <w:r>
+              <w:rPr>
+                <w:rFonts w:ascii="Times New Roman" w:hAnsi="Times New Roman" w:eastAsia="Times New Roman" w:cs="Times New Roman"/>
+                <w:i w:val="false"/>
+                <w:b w:val="false"/>
+                <w:u w:val="none"/>
+                <w:sz w:val="22"/>
+                <w:szCs w:val="22"/>
+                <w:color w:val="000000"/>
+              </w:rPr>
+              <w:t xml:space="preserve">Bandeira Amarela</w:t>
             </w:r>
           </w:p>
         </w:tc>
@@ -303,7 +456,6 @@
         </w:tc>
         <w:tc>
           <w:tcPr>
-            <w:gridSpan w:val="3"/>
             <w:tcBorders>
               <w:bottom w:val="single" w:sz="12" w:space="0" w:color="666666"/>
               <w:top w:val="none" w:sz="0" w:space="0" w:color="666666"/>
@@ -356,7 +508,6 @@
         </w:tc>
         <w:tc>
           <w:tcPr>
-            <w:gridSpan w:val="3"/>
             <w:tcBorders>
               <w:bottom w:val="single" w:sz="12" w:space="0" w:color="666666"/>
               <w:top w:val="none" w:sz="0" w:space="0" w:color="666666"/>
@@ -403,7 +554,215 @@
                 <w:szCs w:val="22"/>
                 <w:color w:val="000000"/>
               </w:rPr>
-              <w:t xml:space="preserve">Gastos totais (%)</w:t>
+              <w:t xml:space="preserve">Renda (%) </w:t>
+            </w:r>
+          </w:p>
+        </w:tc>
+        <w:tc>
+          <w:tcPr>
+            <w:tcBorders>
+              <w:bottom w:val="single" w:sz="12" w:space="0" w:color="666666"/>
+              <w:top w:val="none" w:sz="0" w:space="0" w:color="666666"/>
+              <w:left w:val="none" w:sz="0" w:space="0" w:color="000000"/>
+              <w:right w:val="none" w:sz="0" w:space="0" w:color="000000"/>
+            </w:tcBorders>
+            <w:shd w:val="clear" w:color="auto" w:fill="FFFFFF"/>
+            <w:tcMar>
+              <w:top w:w="0" w:type="dxa"/>
+              <w:bottom w:w="0" w:type="dxa"/>
+              <w:left w:w="0" w:type="dxa"/>
+              <w:right w:w="0" w:type="dxa"/>
+            </w:tcMar>
+            <w:vAlign w:val="center"/>
+          </w:tcPr>
+          <w:p>
+            <w:pPr>
+              <w:jc w:val="center"/>
+              <w:pBdr>
+                <w:bottom w:val="none" w:sz="0" w:space="0" w:color="000000"/>
+                <w:top w:val="none" w:sz="0" w:space="0" w:color="000000"/>
+                <w:left w:val="none" w:sz="0" w:space="0" w:color="000000"/>
+                <w:right w:val="none" w:sz="0" w:space="0" w:color="000000"/>
+              </w:pBdr>
+              <w:spacing w:after="0" w:before="0" w:line="240"/>
+              <w:ind w:left="0" w:right="0" w:firstLine="0" w:firstLineChars="0"/>
+              <w:rPr>
+                <w:rFonts w:ascii="Times New Roman" w:hAnsi="Times New Roman" w:eastAsia="Times New Roman" w:cs="Times New Roman"/>
+                <w:i w:val="false"/>
+                <w:b w:val="false"/>
+                <w:u w:val="none"/>
+                <w:sz w:val="22"/>
+                <w:szCs w:val="22"/>
+                <w:color w:val="000000"/>
+              </w:rPr>
+            </w:pPr>
+            <w:r>
+              <w:rPr>
+                <w:rFonts w:ascii="Times New Roman" w:hAnsi="Times New Roman" w:eastAsia="Times New Roman" w:cs="Times New Roman"/>
+                <w:i w:val="false"/>
+                <w:b w:val="false"/>
+                <w:u w:val="none"/>
+                <w:sz w:val="22"/>
+                <w:szCs w:val="22"/>
+                <w:color w:val="000000"/>
+              </w:rPr>
+              <w:t xml:space="preserve">Renda (%)  </w:t>
+            </w:r>
+          </w:p>
+        </w:tc>
+        <w:tc>
+          <w:tcPr>
+            <w:tcBorders>
+              <w:bottom w:val="single" w:sz="12" w:space="0" w:color="666666"/>
+              <w:top w:val="none" w:sz="0" w:space="0" w:color="666666"/>
+              <w:left w:val="none" w:sz="0" w:space="0" w:color="000000"/>
+              <w:right w:val="none" w:sz="0" w:space="0" w:color="000000"/>
+            </w:tcBorders>
+            <w:shd w:val="clear" w:color="auto" w:fill="FFFFFF"/>
+            <w:tcMar>
+              <w:top w:w="0" w:type="dxa"/>
+              <w:bottom w:w="0" w:type="dxa"/>
+              <w:left w:w="0" w:type="dxa"/>
+              <w:right w:w="0" w:type="dxa"/>
+            </w:tcMar>
+            <w:vAlign w:val="center"/>
+          </w:tcPr>
+          <w:p>
+            <w:pPr>
+              <w:jc w:val="center"/>
+              <w:pBdr>
+                <w:bottom w:val="none" w:sz="0" w:space="0" w:color="000000"/>
+                <w:top w:val="none" w:sz="0" w:space="0" w:color="000000"/>
+                <w:left w:val="none" w:sz="0" w:space="0" w:color="000000"/>
+                <w:right w:val="none" w:sz="0" w:space="0" w:color="000000"/>
+              </w:pBdr>
+              <w:spacing w:after="0" w:before="0" w:line="240"/>
+              <w:ind w:left="0" w:right="0" w:firstLine="0" w:firstLineChars="0"/>
+              <w:rPr>
+                <w:rFonts w:ascii="Times New Roman" w:hAnsi="Times New Roman" w:eastAsia="Times New Roman" w:cs="Times New Roman"/>
+                <w:i w:val="false"/>
+                <w:b w:val="false"/>
+                <w:u w:val="none"/>
+                <w:sz w:val="22"/>
+                <w:szCs w:val="22"/>
+                <w:color w:val="000000"/>
+              </w:rPr>
+            </w:pPr>
+            <w:r>
+              <w:rPr>
+                <w:rFonts w:ascii="Times New Roman" w:hAnsi="Times New Roman" w:eastAsia="Times New Roman" w:cs="Times New Roman"/>
+                <w:i w:val="false"/>
+                <w:b w:val="false"/>
+                <w:u w:val="none"/>
+                <w:sz w:val="22"/>
+                <w:szCs w:val="22"/>
+                <w:color w:val="000000"/>
+              </w:rPr>
+              <w:t xml:space="preserve">Gastos (%)</w:t>
+            </w:r>
+          </w:p>
+        </w:tc>
+        <w:tc>
+          <w:tcPr>
+            <w:tcBorders>
+              <w:bottom w:val="single" w:sz="12" w:space="0" w:color="666666"/>
+              <w:top w:val="none" w:sz="0" w:space="0" w:color="666666"/>
+              <w:left w:val="none" w:sz="0" w:space="0" w:color="000000"/>
+              <w:right w:val="none" w:sz="0" w:space="0" w:color="000000"/>
+            </w:tcBorders>
+            <w:shd w:val="clear" w:color="auto" w:fill="FFFFFF"/>
+            <w:tcMar>
+              <w:top w:w="0" w:type="dxa"/>
+              <w:bottom w:w="0" w:type="dxa"/>
+              <w:left w:w="0" w:type="dxa"/>
+              <w:right w:w="0" w:type="dxa"/>
+            </w:tcMar>
+            <w:vAlign w:val="center"/>
+          </w:tcPr>
+          <w:p>
+            <w:pPr>
+              <w:jc w:val="center"/>
+              <w:pBdr>
+                <w:bottom w:val="none" w:sz="0" w:space="0" w:color="000000"/>
+                <w:top w:val="none" w:sz="0" w:space="0" w:color="000000"/>
+                <w:left w:val="none" w:sz="0" w:space="0" w:color="000000"/>
+                <w:right w:val="none" w:sz="0" w:space="0" w:color="000000"/>
+              </w:pBdr>
+              <w:spacing w:after="0" w:before="0" w:line="240"/>
+              <w:ind w:left="0" w:right="0" w:firstLine="0" w:firstLineChars="0"/>
+              <w:rPr>
+                <w:rFonts w:ascii="Times New Roman" w:hAnsi="Times New Roman" w:eastAsia="Times New Roman" w:cs="Times New Roman"/>
+                <w:i w:val="false"/>
+                <w:b w:val="false"/>
+                <w:u w:val="none"/>
+                <w:sz w:val="22"/>
+                <w:szCs w:val="22"/>
+                <w:color w:val="000000"/>
+              </w:rPr>
+            </w:pPr>
+            <w:r>
+              <w:rPr>
+                <w:rFonts w:ascii="Times New Roman" w:hAnsi="Times New Roman" w:eastAsia="Times New Roman" w:cs="Times New Roman"/>
+                <w:i w:val="false"/>
+                <w:b w:val="false"/>
+                <w:u w:val="none"/>
+                <w:sz w:val="22"/>
+                <w:szCs w:val="22"/>
+                <w:color w:val="000000"/>
+              </w:rPr>
+              <w:t xml:space="preserve">Gastos (%) </w:t>
+            </w:r>
+          </w:p>
+        </w:tc>
+        <w:tc>
+          <w:tcPr>
+            <w:tcBorders>
+              <w:bottom w:val="single" w:sz="12" w:space="0" w:color="666666"/>
+              <w:top w:val="none" w:sz="0" w:space="0" w:color="666666"/>
+              <w:left w:val="none" w:sz="0" w:space="0" w:color="000000"/>
+              <w:right w:val="none" w:sz="0" w:space="0" w:color="000000"/>
+            </w:tcBorders>
+            <w:shd w:val="clear" w:color="auto" w:fill="FFFFFF"/>
+            <w:tcMar>
+              <w:top w:w="0" w:type="dxa"/>
+              <w:bottom w:w="0" w:type="dxa"/>
+              <w:left w:w="0" w:type="dxa"/>
+              <w:right w:w="0" w:type="dxa"/>
+            </w:tcMar>
+            <w:vAlign w:val="center"/>
+          </w:tcPr>
+          <w:p>
+            <w:pPr>
+              <w:jc w:val="center"/>
+              <w:pBdr>
+                <w:bottom w:val="none" w:sz="0" w:space="0" w:color="000000"/>
+                <w:top w:val="none" w:sz="0" w:space="0" w:color="000000"/>
+                <w:left w:val="none" w:sz="0" w:space="0" w:color="000000"/>
+                <w:right w:val="none" w:sz="0" w:space="0" w:color="000000"/>
+              </w:pBdr>
+              <w:spacing w:after="0" w:before="0" w:line="240"/>
+              <w:ind w:left="0" w:right="0" w:firstLine="0" w:firstLineChars="0"/>
+              <w:rPr>
+                <w:rFonts w:ascii="Times New Roman" w:hAnsi="Times New Roman" w:eastAsia="Times New Roman" w:cs="Times New Roman"/>
+                <w:i w:val="false"/>
+                <w:b w:val="false"/>
+                <w:u w:val="none"/>
+                <w:sz w:val="22"/>
+                <w:szCs w:val="22"/>
+                <w:color w:val="000000"/>
+              </w:rPr>
+            </w:pPr>
+            <w:r>
+              <w:rPr>
+                <w:rFonts w:ascii="Times New Roman" w:hAnsi="Times New Roman" w:eastAsia="Times New Roman" w:cs="Times New Roman"/>
+                <w:i w:val="false"/>
+                <w:b w:val="false"/>
+                <w:u w:val="none"/>
+                <w:sz w:val="22"/>
+                <w:szCs w:val="22"/>
+                <w:color w:val="000000"/>
+              </w:rPr>
+              <w:t xml:space="preserve">Gastos (%)  </w:t>
             </w:r>
           </w:p>
         </w:tc>

</xml_diff>